<commit_message>
plantilla v1.0.2: Corrección fecha en plantilla
</commit_message>
<xml_diff>
--- a/plantillas/plantilla_anexos.docx
+++ b/plantillas/plantilla_anexos.docx
@@ -4813,6 +4813,8 @@
         <w:jc w:val="both"/>
         <w:rPr>
           <w:rFonts w:ascii="Arial" w:hAnsi="Arial" w:cs="Arial"/>
+          <w:b/>
+          <w:lang w:val="es-PE"/>
         </w:rPr>
       </w:pPr>
       <w:r>
@@ -4824,46 +4826,10 @@
       <w:r>
         <w:rPr>
           <w:rFonts w:ascii="Arial" w:hAnsi="Arial" w:cs="Arial"/>
-        </w:rPr>
-        <w:t xml:space="preserve">Abril </w:t>
-      </w:r>
-      <w:r>
-        <w:rPr>
-          <w:rFonts w:ascii="Arial" w:hAnsi="Arial" w:cs="Arial"/>
-        </w:rPr>
-        <w:t>de</w:t>
-      </w:r>
-      <w:r>
-        <w:rPr>
-          <w:rFonts w:ascii="Arial" w:hAnsi="Arial" w:cs="Arial"/>
-        </w:rPr>
-        <w:t>l</w:t>
-      </w:r>
-      <w:r>
-        <w:rPr>
-          <w:rFonts w:ascii="Arial" w:hAnsi="Arial" w:cs="Arial"/>
-        </w:rPr>
-        <w:t xml:space="preserve"> 202</w:t>
-      </w:r>
-      <w:r>
-        <w:rPr>
-          <w:rFonts w:ascii="Arial" w:hAnsi="Arial" w:cs="Arial"/>
-        </w:rPr>
-        <w:t>6</w:t>
-      </w:r>
-    </w:p>
-    <w:p>
-      <w:pPr>
-        <w:widowControl/>
-        <w:autoSpaceDE/>
-        <w:autoSpaceDN/>
-        <w:spacing w:after="200" w:line="276" w:lineRule="auto"/>
-        <w:rPr>
-          <w:rFonts w:ascii="Arial" w:hAnsi="Arial" w:cs="Arial"/>
-          <w:b/>
-          <w:lang w:val="es-PE"/>
-        </w:rPr>
-      </w:pPr>
+          <w:lang w:val="pt-PT"/>
+        </w:rPr>
+        <w:t>{{MES}} de {{ANO}}</w:t>
+      </w:r>
     </w:p>
     <w:p>
       <w:pPr>
@@ -5261,7 +5227,39 @@
           <w:rFonts w:ascii="Arial" w:hAnsi="Arial" w:cs="Arial"/>
           <w:lang w:val="es-PE"/>
         </w:rPr>
-        <w:t>No estar incurso en la prohibición de nepotismo conforme a la Ley Nº 26771, modificada por la Ley Nº 30294, que establece la prohibición de ejercer la facultad de nombramiento y contratación de personal en el sector público en caso de parentesco.</w:t>
+        <w:t xml:space="preserve">No estar incurso en la prohibición de nepotismo conforme a la Ley </w:t>
+      </w:r>
+      <w:proofErr w:type="spellStart"/>
+      <w:r>
+        <w:rPr>
+          <w:rFonts w:ascii="Arial" w:hAnsi="Arial" w:cs="Arial"/>
+          <w:lang w:val="es-PE"/>
+        </w:rPr>
+        <w:t>Nº</w:t>
+      </w:r>
+      <w:proofErr w:type="spellEnd"/>
+      <w:r>
+        <w:rPr>
+          <w:rFonts w:ascii="Arial" w:hAnsi="Arial" w:cs="Arial"/>
+          <w:lang w:val="es-PE"/>
+        </w:rPr>
+        <w:t xml:space="preserve"> 26771, modificada por la Ley </w:t>
+      </w:r>
+      <w:proofErr w:type="spellStart"/>
+      <w:r>
+        <w:rPr>
+          <w:rFonts w:ascii="Arial" w:hAnsi="Arial" w:cs="Arial"/>
+          <w:lang w:val="es-PE"/>
+        </w:rPr>
+        <w:t>Nº</w:t>
+      </w:r>
+      <w:proofErr w:type="spellEnd"/>
+      <w:r>
+        <w:rPr>
+          <w:rFonts w:ascii="Arial" w:hAnsi="Arial" w:cs="Arial"/>
+          <w:lang w:val="es-PE"/>
+        </w:rPr>
+        <w:t xml:space="preserve"> 30294, que establece la prohibición de ejercer la facultad de nombramiento y contratación de personal en el sector público en caso de parentesco.</w:t>
       </w:r>
     </w:p>
     <w:p>

</xml_diff>